<commit_message>
docs: dọn bộ tài liệu thành docs-repo chuẩn và bổ sung thiết kế Tuần 6
- Chuyển design/ sang cấu trúc con: class, usecase, sequence, catengine,
  component-deployment, structure, ui (đổi tên giữ lịch sử, #123).
- Thêm plans/ (nghiệp vụ import, sinh và duyệt đề AI, CI/CD, dữ liệu item bank),
  decisions/, drafts/ cho tài liệu chưa chốt, packages/shared-types.
- Thêm Component Diagram, Deployment Diagram và bản mô tả; đánh giá CI/CD backend.
- Cập nhật SRS v3.0 (md + docx), đặc tả use case, CLAUDE.md, INDEX, README,
  AI_USAGE_LOG; gỡ SRS v2.6 và đặc tả UC cũ (đã lưu ở _ARCHIVE_20261024).
</commit_message>
<xml_diff>
--- a/requirements/20261016_MoHinhHoaYeuCau.docx
+++ b/requirements/20261016_MoHinhHoaYeuCau.docx
@@ -5019,7 +5019,7 @@
               <w:rPr>
                 <w:sz w:val="19"/>
               </w:rPr>
-              <w:t>1. Sinh viên mở danh sách kỳ thi của tôi (/exams).</w:t>
+              <w:t>1. Sinh viên mở danh sách kỳ thi của tôi (/student/dashboard, thẻ 'Kỳ thi của tôi').</w:t>
               <w:br/>
               <w:t>2. Hệ thống hiển thị các kỳ thi mà sinh viên thuộc danh sách tham gia kèm trạng thái hiệu lực (effectiveStatus).</w:t>
               <w:br/>
@@ -5039,7 +5039,7 @@
               <w:br/>
               <w:t>6. Hệ thống khởi tạo trạng thái phiên thi trong Redis (SessionCacheState: thetaInit = -0.5, lưới 41 điểm EAP).</w:t>
               <w:br/>
-              <w:t>7. Hệ thống chuyển sinh viên đến giao diện làm bài thi (/exams/[id]/take).</w:t>
+              <w:t>7. Hệ thống chuyển sinh viên đến giao diện làm bài thi (/student/exams/[roundId]/take).</w:t>
             </w:r>
           </w:p>
         </w:tc>
@@ -10196,6 +10196,8 @@
               <w:t>3. Admin xem danh sách chi tiết từng thí sinh: MSSV, Họ tên, Trạng thái, Điểm chẩn đoán (nếu đã hoàn thành), Thời điểm bắt đầu, Thời điểm nộp bài.</w:t>
               <w:br/>
               <w:t>4. Admin có thể lọc theo trạng thái dự thi hoặc tìm kiếm theo MSSV.</w:t>
+              <w:br/>
+              <w:t>5. Admin tick một hoặc nhiều sinh viên (hoặc 'chọn tất cả theo bộ lọc') rồi bấm 'Xuất CSV' hoặc 'Xuất Excel'; nếu không tick dòng nào thì xuất toàn bộ danh sách đang lọc (đề xuất 18/10/2026).</w:t>
             </w:r>
           </w:p>
         </w:tc>
@@ -10237,7 +10239,9 @@
               <w:rPr>
                 <w:sz w:val="19"/>
               </w:rPr>
-              <w:t>Không có.</w:t>
+              <w:t>5a. Không tick dòng nào: hệ thống xuất toàn bộ sinh viên khớp bộ lọc hiện tại.</w:t>
+              <w:br/>
+              <w:t>5b. Tick một sinh viên: xuất kết quả riêng của sinh viên đó.</w:t>
             </w:r>
           </w:p>
         </w:tc>
@@ -10279,7 +10283,11 @@
               <w:rPr>
                 <w:sz w:val="19"/>
               </w:rPr>
-              <w:t>Không có.</w:t>
+              <w:t>5c. Người dùng không phải Admin gọi API xuất: HTTP 403.</w:t>
+              <w:br/>
+              <w:t>5d. Không có dòng nào khớp bộ lọc: hệ thống báo 'Không có dữ liệu để xuất' (không tạo file).</w:t>
+              <w:br/>
+              <w:t>5e. Ô văn bản bắt đầu bằng =, +, - hoặc @ được vô hiệu hóa trong cả CSV và Excel (chống CSV injection).</w:t>
             </w:r>
           </w:p>
         </w:tc>
@@ -10366,6 +10374,10 @@
                 <w:sz w:val="19"/>
               </w:rPr>
               <w:t>- Given kỳ thi đang OPEN có 100 sinh viên When Admin mở màn hình theo dõi Then thấy rõ số lượng sinh viên đang làm bài và danh sách cập nhật theo thời gian thực.</w:t>
+              <w:br/>
+              <w:t>- Given Admin tick 3 sinh viên ở màn theo dõi dự thi When bấm Xuất Excel Then tệp .xlsx chỉ chứa 3 sinh viên đó, đúng các cột MSSV, Họ tên, Trạng thái, CEFR, θ, SE, thời điểm bắt đầu và nộp.</w:t>
+              <w:br/>
+              <w:t>- Given Admin lọc trạng thái 'Hoàn thành' và không tick dòng nào When bấm Xuất CSV Then tệp chứa mọi sinh viên hoàn thành của kỳ.</w:t>
             </w:r>
           </w:p>
         </w:tc>
@@ -11768,7 +11780,7 @@
               <w:br/>
               <w:t>1b. Ép gửi gói (FORCE_SEND) khi GV A quá hạn mà chưa gửi: Admin chọn 'Ép gửi gói' (POST /item-packages/:id/force-send). Gói OPEN của A chuyển SENT chỉ gồm các câu A đã FIRST_APPROVED; câu A chưa quyết không vào gói và nằm lại trong lô; hạn của GV B tính từ ngày ép gửi; ghi nhật ký FORCE_SEND. Admin không sửa nội dung câu.</w:t>
               <w:br/>
-              <w:t>1c. Câu chưa xử lý sau hạn (còn DRAFT hoặc FIRST_APPROVED chưa tới B): không được import; Admin chọn giao lại với hạn mới (lô trở về IN_REVIEW) hoặc loại các câu đó thành REJECTED (không cần lý do, không sửa nội dung). Đề xuất bổ sung 16/10/2026, chờ chốt.</w:t>
+              <w:t>1c. Quy tắc (chốt 18/10/2026): đến hạn mọi GV phải hoàn thành việc được giao; chỉnh hạn, giao lại và ép gửi gói chỉ là biện pháp dự phòng của Admin trước khi chạy C3.</w:t>
             </w:r>
           </w:p>
         </w:tc>
@@ -12241,7 +12253,7 @@
               <w:br/>
               <w:t>7. Admin bấm 'Import vào ngân hàng'.</w:t>
               <w:br/>
-              <w:t>8. Hệ thống chạy lại kiểm tra trùng nhanh T1-T2 chống race condition, chuyển toàn bộ câu SECOND_APPROVED hợp lệ thành FINAL_APPROVED (ghi nhận approvedBy, approvedAt). Lô chuyển DONE khi mọi câu đã ở trạng thái cuối (FINAL_APPROVED, REJECTED hoặc AI_REJECTED); nếu còn câu DRAFT/FIRST_APPROVED chưa xử lý (quá hạn), lô giữ FINAL_CHECKED để Admin giao lại hoặc loại các câu đó (UCADM13, luồng 1c).</w:t>
+              <w:t>8. Hệ thống chạy lại kiểm tra trùng nhanh T1-T2 chống race condition, chuyển toàn bộ câu SECOND_APPROVED hợp lệ thành FINAL_APPROVED (ghi nhận approvedBy, approvedAt), chuyển trạng thái lô thành DONE (mọi câu đã ở trạng thái cuối: FINAL_APPROVED, REJECTED hoặc AI_REJECTED).</w:t>
             </w:r>
           </w:p>
         </w:tc>
@@ -12736,13 +12748,13 @@
               <w:rPr>
                 <w:sz w:val="19"/>
               </w:rPr>
-              <w:t xml:space="preserve">1. Sinh viên được chuyển sang trang kết quả (/results/[sessionId]) ngay sau khi phiên kết thúc (UCSV03), hoặc mở lại từ Lịch sử (UCSV06).</w:t>
+              <w:t>1. Sinh viên được chuyển sang trang kết quả (/student/results/[sessionId]) ngay sau khi phiên kết thúc (UCSV03), hoặc mở lại từ Lịch sử (UCSV06).</w:t>
               <w:br/>
-              <w:t xml:space="preserve">2. Hệ thống kiểm tra phiên thuộc về sinh viên đang đăng nhập và đang ở trạng thái COMPLETED.</w:t>
+              <w:t>2. Hệ thống kiểm tra phiên thuộc về sinh viên đang đăng nhập và đang ở trạng thái COMPLETED.</w:t>
               <w:br/>
-              <w:t xml:space="preserve">3. Hệ thống lấy kết quả phiên và hồ sơ năng lực (GET /sessions/:id/result).</w:t>
+              <w:t>3. Hệ thống lấy kết quả phiên và hồ sơ năng lực (GET /sessions/:id/result).</w:t>
               <w:br/>
-              <w:t xml:space="preserve">4. Hệ thống hiển thị:</w:t>
+              <w:t>4. Hệ thống hiển thị:</w:t>
               <w:br/>
               <w:t xml:space="preserve">   - Mức CEFR ước lượng (cefr_level) và độ tin cậy (cefr_confidence).</w:t>
               <w:br/>
@@ -12754,7 +12766,7 @@
               <w:br/>
               <w:t xml:space="preserve">   - Lý do dừng bài thi (stopping_reason) và thời lượng làm bài.</w:t>
               <w:br/>
-              <w:t xml:space="preserve">5. Sinh viên có thể chọn 'Xem giải thích' để thực hiện UCSV05 hoặc quay lại Lịch sử (UCSV06).</w:t>
+              <w:t>5. Sinh viên có thể chọn 'Xem giải thích' để thực hiện UCSV05 hoặc quay lại Lịch sử (UCSV06).</w:t>
             </w:r>
           </w:p>
         </w:tc>
@@ -13255,15 +13267,15 @@
               <w:rPr>
                 <w:sz w:val="19"/>
               </w:rPr>
-              <w:t xml:space="preserve">1. Từ trang kết quả, sinh viên chọn 'Xem lại đáp án' (/results/[sessionId]/review) — quan hệ &lt;&lt;extend&gt;&gt; của UCSV04.</w:t>
+              <w:t>1. Từ trang kết quả, sinh viên chọn 'Xem lại đáp án' (/student/results/[sessionId]/review) — quan hệ &lt;&lt;extend&gt;&gt; của UCSV04.</w:t>
               <w:br/>
-              <w:t xml:space="preserve">2. Hệ thống kiểm tra phiên thuộc sinh viên, đã COMPLETED và chức năng xem lại đang bật.</w:t>
+              <w:t>2. Hệ thống kiểm tra phiên thuộc sinh viên, đã COMPLETED và chức năng xem lại đang bật.</w:t>
               <w:br/>
-              <w:t xml:space="preserve">3. Hệ thống trả về danh sách các câu sinh viên đã làm theo thứ tự làm bài, mỗi câu gồm: nội dung, 4 phương án, đáp án sinh viên đã chọn, đáp án đúng và đúng/sai.</w:t>
+              <w:t>3. Hệ thống trả về danh sách các câu sinh viên đã làm theo thứ tự làm bài, mỗi câu gồm: nội dung, 4 phương án, đáp án sinh viên đã chọn, đáp án đúng và đúng/sai.</w:t>
               <w:br/>
-              <w:t xml:space="preserve">4. Với mỗi câu, hệ thống đọc lời giải thích đã lưu trong bảng explanations gắn với Item (giải thích được AI sinh cùng lúc với câu hỏi, dùng chung cho mọi sinh viên) và hiển thị kèm câu.</w:t>
+              <w:t>4. Với mỗi câu, hệ thống đọc lời giải thích đã lưu trong bảng explanations gắn với Item (giải thích được AI sinh cùng lúc với câu hỏi, dùng chung cho mọi sinh viên) và hiển thị kèm câu.</w:t>
               <w:br/>
-              <w:t xml:space="preserve">5. Sinh viên có thể lọc nhanh các câu làm sai, mở từng câu để đọc giải thích và quay lại trang kết quả.</w:t>
+              <w:t>5. Sinh viên có thể lọc nhanh các câu làm sai, mở từng câu để đọc giải thích và quay lại trang kết quả.</w:t>
             </w:r>
           </w:p>
         </w:tc>
@@ -13762,13 +13774,13 @@
               <w:rPr>
                 <w:sz w:val="19"/>
               </w:rPr>
-              <w:t xml:space="preserve">1. Sinh viên mở mục Lịch sử (/history).</w:t>
+              <w:t>1. Sinh viên mở mục Lịch sử (/student/history).</w:t>
               <w:br/>
-              <w:t xml:space="preserve">2. Hệ thống lấy lịch sử hồ sơ năng lực của chính sinh viên (GET /placement-profiles/:student_id/history; student_id phải trùng JWT).</w:t>
+              <w:t>2. Hệ thống lấy lịch sử hồ sơ năng lực của chính sinh viên (GET /placement-profiles/:student_id/history; student_id phải trùng JWT).</w:t>
               <w:br/>
-              <w:t xml:space="preserve">3. Hệ thống hiển thị bảng các lần thi, sắp xếp mới nhất trước, mỗi dòng gồm: thời điểm bắt đầu, thời lượng, mức CEFR, θ, trạng thái phiên (COMPLETED / ABANDONED / IN_PROGRESS) và lý do dừng.</w:t>
+              <w:t>3. Hệ thống hiển thị bảng các lần thi, sắp xếp mới nhất trước, mỗi dòng gồm: thời điểm bắt đầu, thời lượng, mức CEFR, θ, trạng thái phiên (COMPLETED / ABANDONED / IN_PROGRESS) và lý do dừng.</w:t>
               <w:br/>
-              <w:t xml:space="preserve">4. Sinh viên chọn một dòng COMPLETED để xem lại kết quả chi tiết (UCSV04).</w:t>
+              <w:t>4. Sinh viên chọn một dòng COMPLETED để xem lại kết quả chi tiết (UCSV04).</w:t>
             </w:r>
           </w:p>
         </w:tc>
@@ -14267,17 +14279,17 @@
               <w:rPr>
                 <w:sz w:val="19"/>
               </w:rPr>
-              <w:t xml:space="preserve">1. Sinh viên mở trang chủ; hệ thống gọi GET /sessions/active và phát hiện phiên IN_PROGRESS, hiển thị thẻ 'Tiếp tục bài thi' kèm tên kỳ thi và thời gian còn lại (tính theo expiresAt).</w:t>
+              <w:t>1. Sinh viên mở trang chủ; hệ thống gọi GET /sessions/active và phát hiện phiên IN_PROGRESS, hiển thị thẻ 'Tiếp tục bài thi' kèm tên kỳ thi và thời gian còn lại (tính theo expiresAt).</w:t>
               <w:br/>
-              <w:t xml:space="preserve">2. Sinh viên bấm 'Tiếp tục'.</w:t>
+              <w:t>2. Sinh viên bấm 'Tiếp tục'.</w:t>
               <w:br/>
-              <w:t xml:space="preserve">3. Hệ thống kiểm tra phiên thuộc sinh viên, trạng thái IN_PROGRESS và now &lt; expires_at.</w:t>
+              <w:t>3. Hệ thống kiểm tra phiên thuộc sinh viên, trạng thái IN_PROGRESS và now &lt; expires_at.</w:t>
               <w:br/>
-              <w:t xml:space="preserve">4. Hệ thống gọi GET /sessions/:id/resume để lấy lại trạng thái phiên: ưu tiên đọc SessionCacheState trong Redis (TTL 7200 giây).</w:t>
+              <w:t>4. Hệ thống gọi GET /sessions/:id/resume để lấy lại trạng thái phiên: ưu tiên đọc SessionCacheState trong Redis (TTL 7200 giây).</w:t>
               <w:br/>
-              <w:t xml:space="preserve">5. Hệ thống trả về câu hỏi hiện tại chưa được trả lời (không lặp lại các câu đã trả lời), số câu đã làm và thời gian còn lại.</w:t>
+              <w:t>5. Hệ thống trả về câu hỏi hiện tại chưa được trả lời (không lặp lại các câu đã trả lời), số câu đã làm và thời gian còn lại.</w:t>
               <w:br/>
-              <w:t xml:space="preserve">6. Sinh viên làm tiếp ở giao diện làm bài (/exam/[sessionId]) theo UCSV03.</w:t>
+              <w:t>6. Sinh viên làm tiếp ở giao diện làm bài (/student/exams/[roundId]/take) theo UCSV03.</w:t>
             </w:r>
           </w:p>
         </w:tc>

</xml_diff>